<commit_message>
Finals (Readme, instal node.js lts)
</commit_message>
<xml_diff>
--- a/ORLANDO RYAN SADEWA - P11/Worksheet/11. Worksheet_PABW_Pertemuan11 - ID (revisi sinkron).docx
+++ b/ORLANDO RYAN SADEWA - P11/Worksheet/11. Worksheet_PABW_Pertemuan11 - ID (revisi sinkron).docx
@@ -2762,75 +2762,34 @@
                 <w:sz w:val="18"/>
                 <w:szCs w:val="18"/>
               </w:rPr>
-              <w:t xml:space="preserve">Tidak </w:t>
-            </w:r>
-            <w:proofErr w:type="spellStart"/>
-            <w:r>
+              <w:t>Tidak ada</w:t>
+            </w:r>
+          </w:p>
+        </w:tc>
+        <w:tc>
+          <w:tcPr>
+            <w:tcW w:w="2801" w:type="dxa"/>
+            <w:tcBorders>
+              <w:top w:val="single" w:sz="6" w:space="0" w:color="D8DEE9"/>
+              <w:left w:val="single" w:sz="6" w:space="0" w:color="D8DEE9"/>
+              <w:bottom w:val="single" w:sz="6" w:space="0" w:color="D8DEE9"/>
+              <w:right w:val="single" w:sz="6" w:space="0" w:color="D8DEE9"/>
+            </w:tcBorders>
+          </w:tcPr>
+          <w:p>
+            <w:pPr>
+              <w:spacing w:before="20" w:after="20" w:line="252" w:lineRule="auto"/>
               <w:rPr>
                 <w:sz w:val="18"/>
                 <w:szCs w:val="18"/>
               </w:rPr>
-              <w:t>ada</w:t>
-            </w:r>
-            <w:proofErr w:type="spellEnd"/>
-          </w:p>
-        </w:tc>
-        <w:tc>
-          <w:tcPr>
-            <w:tcW w:w="2801" w:type="dxa"/>
-            <w:tcBorders>
-              <w:top w:val="single" w:sz="6" w:space="0" w:color="D8DEE9"/>
-              <w:left w:val="single" w:sz="6" w:space="0" w:color="D8DEE9"/>
-              <w:bottom w:val="single" w:sz="6" w:space="0" w:color="D8DEE9"/>
-              <w:right w:val="single" w:sz="6" w:space="0" w:color="D8DEE9"/>
-            </w:tcBorders>
-          </w:tcPr>
-          <w:p>
-            <w:pPr>
-              <w:spacing w:before="20" w:after="20" w:line="252" w:lineRule="auto"/>
+            </w:pPr>
+            <w:r>
               <w:rPr>
                 <w:sz w:val="18"/>
                 <w:szCs w:val="18"/>
               </w:rPr>
-            </w:pPr>
-            <w:r>
-              <w:rPr>
-                <w:sz w:val="18"/>
-                <w:szCs w:val="18"/>
-              </w:rPr>
-              <w:t xml:space="preserve">Hanya </w:t>
-            </w:r>
-            <w:proofErr w:type="spellStart"/>
-            <w:r>
-              <w:rPr>
-                <w:sz w:val="18"/>
-                <w:szCs w:val="18"/>
-              </w:rPr>
-              <w:t>mengambil</w:t>
-            </w:r>
-            <w:proofErr w:type="spellEnd"/>
-            <w:r>
-              <w:rPr>
-                <w:sz w:val="18"/>
-                <w:szCs w:val="18"/>
-              </w:rPr>
-              <w:t xml:space="preserve"> </w:t>
-            </w:r>
-            <w:proofErr w:type="spellStart"/>
-            <w:r>
-              <w:rPr>
-                <w:sz w:val="18"/>
-                <w:szCs w:val="18"/>
-              </w:rPr>
-              <w:t>dari</w:t>
-            </w:r>
-            <w:proofErr w:type="spellEnd"/>
-            <w:r>
-              <w:rPr>
-                <w:sz w:val="18"/>
-                <w:szCs w:val="18"/>
-              </w:rPr>
-              <w:t xml:space="preserve"> P10</w:t>
+              <w:t>Hanya mengambil dari P10</w:t>
             </w:r>
           </w:p>
         </w:tc>
@@ -2891,75 +2850,34 @@
                 <w:sz w:val="18"/>
                 <w:szCs w:val="18"/>
               </w:rPr>
-              <w:t xml:space="preserve">Tidak </w:t>
-            </w:r>
-            <w:proofErr w:type="spellStart"/>
-            <w:r>
+              <w:t>Tidak ada</w:t>
+            </w:r>
+          </w:p>
+        </w:tc>
+        <w:tc>
+          <w:tcPr>
+            <w:tcW w:w="2801" w:type="dxa"/>
+            <w:tcBorders>
+              <w:top w:val="single" w:sz="6" w:space="0" w:color="D8DEE9"/>
+              <w:left w:val="single" w:sz="6" w:space="0" w:color="D8DEE9"/>
+              <w:bottom w:val="single" w:sz="6" w:space="0" w:color="D8DEE9"/>
+              <w:right w:val="single" w:sz="6" w:space="0" w:color="D8DEE9"/>
+            </w:tcBorders>
+          </w:tcPr>
+          <w:p>
+            <w:pPr>
+              <w:spacing w:before="20" w:after="20" w:line="252" w:lineRule="auto"/>
               <w:rPr>
                 <w:sz w:val="18"/>
                 <w:szCs w:val="18"/>
               </w:rPr>
-              <w:t>ada</w:t>
-            </w:r>
-            <w:proofErr w:type="spellEnd"/>
-          </w:p>
-        </w:tc>
-        <w:tc>
-          <w:tcPr>
-            <w:tcW w:w="2801" w:type="dxa"/>
-            <w:tcBorders>
-              <w:top w:val="single" w:sz="6" w:space="0" w:color="D8DEE9"/>
-              <w:left w:val="single" w:sz="6" w:space="0" w:color="D8DEE9"/>
-              <w:bottom w:val="single" w:sz="6" w:space="0" w:color="D8DEE9"/>
-              <w:right w:val="single" w:sz="6" w:space="0" w:color="D8DEE9"/>
-            </w:tcBorders>
-          </w:tcPr>
-          <w:p>
-            <w:pPr>
-              <w:spacing w:before="20" w:after="20" w:line="252" w:lineRule="auto"/>
+            </w:pPr>
+            <w:r>
               <w:rPr>
                 <w:sz w:val="18"/>
                 <w:szCs w:val="18"/>
               </w:rPr>
-            </w:pPr>
-            <w:r>
-              <w:rPr>
-                <w:sz w:val="18"/>
-                <w:szCs w:val="18"/>
-              </w:rPr>
-              <w:t xml:space="preserve">Hanya </w:t>
-            </w:r>
-            <w:proofErr w:type="spellStart"/>
-            <w:r>
-              <w:rPr>
-                <w:sz w:val="18"/>
-                <w:szCs w:val="18"/>
-              </w:rPr>
-              <w:t>mengambil</w:t>
-            </w:r>
-            <w:proofErr w:type="spellEnd"/>
-            <w:r>
-              <w:rPr>
-                <w:sz w:val="18"/>
-                <w:szCs w:val="18"/>
-              </w:rPr>
-              <w:t xml:space="preserve"> </w:t>
-            </w:r>
-            <w:proofErr w:type="spellStart"/>
-            <w:r>
-              <w:rPr>
-                <w:sz w:val="18"/>
-                <w:szCs w:val="18"/>
-              </w:rPr>
-              <w:t>dari</w:t>
-            </w:r>
-            <w:proofErr w:type="spellEnd"/>
-            <w:r>
-              <w:rPr>
-                <w:sz w:val="18"/>
-                <w:szCs w:val="18"/>
-              </w:rPr>
-              <w:t xml:space="preserve"> P10</w:t>
+              <w:t>Hanya mengambil dari P10</w:t>
             </w:r>
           </w:p>
         </w:tc>
@@ -3020,75 +2938,34 @@
                 <w:sz w:val="18"/>
                 <w:szCs w:val="18"/>
               </w:rPr>
-              <w:t xml:space="preserve">Tidak </w:t>
-            </w:r>
-            <w:proofErr w:type="spellStart"/>
-            <w:r>
+              <w:t>Tidak ada</w:t>
+            </w:r>
+          </w:p>
+        </w:tc>
+        <w:tc>
+          <w:tcPr>
+            <w:tcW w:w="2801" w:type="dxa"/>
+            <w:tcBorders>
+              <w:top w:val="single" w:sz="6" w:space="0" w:color="D8DEE9"/>
+              <w:left w:val="single" w:sz="6" w:space="0" w:color="D8DEE9"/>
+              <w:bottom w:val="single" w:sz="6" w:space="0" w:color="D8DEE9"/>
+              <w:right w:val="single" w:sz="6" w:space="0" w:color="D8DEE9"/>
+            </w:tcBorders>
+          </w:tcPr>
+          <w:p>
+            <w:pPr>
+              <w:spacing w:before="20" w:after="20" w:line="252" w:lineRule="auto"/>
               <w:rPr>
                 <w:sz w:val="18"/>
                 <w:szCs w:val="18"/>
               </w:rPr>
-              <w:t>ada</w:t>
-            </w:r>
-            <w:proofErr w:type="spellEnd"/>
-          </w:p>
-        </w:tc>
-        <w:tc>
-          <w:tcPr>
-            <w:tcW w:w="2801" w:type="dxa"/>
-            <w:tcBorders>
-              <w:top w:val="single" w:sz="6" w:space="0" w:color="D8DEE9"/>
-              <w:left w:val="single" w:sz="6" w:space="0" w:color="D8DEE9"/>
-              <w:bottom w:val="single" w:sz="6" w:space="0" w:color="D8DEE9"/>
-              <w:right w:val="single" w:sz="6" w:space="0" w:color="D8DEE9"/>
-            </w:tcBorders>
-          </w:tcPr>
-          <w:p>
-            <w:pPr>
-              <w:spacing w:before="20" w:after="20" w:line="252" w:lineRule="auto"/>
+            </w:pPr>
+            <w:r>
               <w:rPr>
                 <w:sz w:val="18"/>
                 <w:szCs w:val="18"/>
               </w:rPr>
-            </w:pPr>
-            <w:r>
-              <w:rPr>
-                <w:sz w:val="18"/>
-                <w:szCs w:val="18"/>
-              </w:rPr>
-              <w:t xml:space="preserve">Hanya </w:t>
-            </w:r>
-            <w:proofErr w:type="spellStart"/>
-            <w:r>
-              <w:rPr>
-                <w:sz w:val="18"/>
-                <w:szCs w:val="18"/>
-              </w:rPr>
-              <w:t>mengambil</w:t>
-            </w:r>
-            <w:proofErr w:type="spellEnd"/>
-            <w:r>
-              <w:rPr>
-                <w:sz w:val="18"/>
-                <w:szCs w:val="18"/>
-              </w:rPr>
-              <w:t xml:space="preserve"> </w:t>
-            </w:r>
-            <w:proofErr w:type="spellStart"/>
-            <w:r>
-              <w:rPr>
-                <w:sz w:val="18"/>
-                <w:szCs w:val="18"/>
-              </w:rPr>
-              <w:t>dari</w:t>
-            </w:r>
-            <w:proofErr w:type="spellEnd"/>
-            <w:r>
-              <w:rPr>
-                <w:sz w:val="18"/>
-                <w:szCs w:val="18"/>
-              </w:rPr>
-              <w:t xml:space="preserve"> P10</w:t>
+              <w:t>Hanya mengambil dari P10</w:t>
             </w:r>
           </w:p>
         </w:tc>
@@ -3337,33 +3214,13 @@
                 <w:lang w:val="en-ID"/>
               </w:rPr>
             </w:pPr>
-            <w:proofErr w:type="spellStart"/>
-            <w:proofErr w:type="gramStart"/>
             <w:r>
               <w:rPr>
                 <w:sz w:val="18"/>
                 <w:szCs w:val="18"/>
                 <w:lang w:val="en-ID"/>
               </w:rPr>
-              <w:t>muat</w:t>
-            </w:r>
-            <w:proofErr w:type="spellEnd"/>
-            <w:r>
-              <w:rPr>
-                <w:sz w:val="18"/>
-                <w:szCs w:val="18"/>
-                <w:lang w:val="en-ID"/>
-              </w:rPr>
-              <w:t>(</w:t>
-            </w:r>
-            <w:proofErr w:type="gramEnd"/>
-            <w:r>
-              <w:rPr>
-                <w:sz w:val="18"/>
-                <w:szCs w:val="18"/>
-                <w:lang w:val="en-ID"/>
-              </w:rPr>
-              <w:t>);</w:t>
+              <w:t>muat();</w:t>
             </w:r>
           </w:p>
         </w:tc>
@@ -3731,47 +3588,13 @@
                 <w:szCs w:val="18"/>
               </w:rPr>
             </w:pPr>
-            <w:proofErr w:type="spellStart"/>
             <w:r>
               <w:rPr>
                 <w:sz w:val="18"/>
                 <w:szCs w:val="18"/>
               </w:rPr>
-              <w:t>Buat</w:t>
-            </w:r>
-            <w:proofErr w:type="spellEnd"/>
-            <w:r>
-              <w:rPr>
-                <w:sz w:val="18"/>
-                <w:szCs w:val="18"/>
-              </w:rPr>
-              <w:t xml:space="preserve"> </w:t>
-            </w:r>
-            <w:proofErr w:type="spellStart"/>
-            <w:r>
-              <w:rPr>
-                <w:sz w:val="18"/>
-                <w:szCs w:val="18"/>
-              </w:rPr>
-              <w:t>dari</w:t>
-            </w:r>
-            <w:proofErr w:type="spellEnd"/>
-            <w:r>
-              <w:rPr>
-                <w:sz w:val="18"/>
-                <w:szCs w:val="18"/>
-              </w:rPr>
-              <w:t xml:space="preserve"> P11 </w:t>
-            </w:r>
-            <w:proofErr w:type="spellStart"/>
-            <w:r>
-              <w:rPr>
-                <w:sz w:val="18"/>
-                <w:szCs w:val="18"/>
-              </w:rPr>
-              <w:t>ini</w:t>
-            </w:r>
-            <w:proofErr w:type="spellEnd"/>
+              <w:t>Buat dari P11 ini</w:t>
+            </w:r>
           </w:p>
         </w:tc>
       </w:tr>
@@ -3925,47 +3748,13 @@
                 <w:szCs w:val="18"/>
               </w:rPr>
             </w:pPr>
-            <w:proofErr w:type="spellStart"/>
             <w:r>
               <w:rPr>
                 <w:sz w:val="18"/>
                 <w:szCs w:val="18"/>
               </w:rPr>
-              <w:t>Buat</w:t>
-            </w:r>
-            <w:proofErr w:type="spellEnd"/>
-            <w:r>
-              <w:rPr>
-                <w:sz w:val="18"/>
-                <w:szCs w:val="18"/>
-              </w:rPr>
-              <w:t xml:space="preserve"> </w:t>
-            </w:r>
-            <w:proofErr w:type="spellStart"/>
-            <w:r>
-              <w:rPr>
-                <w:sz w:val="18"/>
-                <w:szCs w:val="18"/>
-              </w:rPr>
-              <w:t>dari</w:t>
-            </w:r>
-            <w:proofErr w:type="spellEnd"/>
-            <w:r>
-              <w:rPr>
-                <w:sz w:val="18"/>
-                <w:szCs w:val="18"/>
-              </w:rPr>
-              <w:t xml:space="preserve"> P11 </w:t>
-            </w:r>
-            <w:proofErr w:type="spellStart"/>
-            <w:r>
-              <w:rPr>
-                <w:sz w:val="18"/>
-                <w:szCs w:val="18"/>
-              </w:rPr>
-              <w:t>ini</w:t>
-            </w:r>
-            <w:proofErr w:type="spellEnd"/>
+              <w:t>Buat dari P11 ini</w:t>
+            </w:r>
           </w:p>
         </w:tc>
       </w:tr>
@@ -6476,7 +6265,18 @@
           <w:p>
             <w:pPr>
               <w:spacing w:before="20" w:after="20" w:line="252" w:lineRule="auto"/>
-            </w:pPr>
+              <w:rPr>
+                <w:sz w:val="18"/>
+                <w:szCs w:val="18"/>
+              </w:rPr>
+            </w:pPr>
+            <w:r>
+              <w:rPr>
+                <w:sz w:val="18"/>
+                <w:szCs w:val="18"/>
+              </w:rPr>
+              <w:t>Sudah sesuai</w:t>
+            </w:r>
           </w:p>
         </w:tc>
       </w:tr>
@@ -6545,7 +6345,18 @@
           <w:p>
             <w:pPr>
               <w:spacing w:before="20" w:after="20" w:line="252" w:lineRule="auto"/>
-            </w:pPr>
+              <w:rPr>
+                <w:sz w:val="18"/>
+                <w:szCs w:val="18"/>
+              </w:rPr>
+            </w:pPr>
+            <w:r>
+              <w:rPr>
+                <w:sz w:val="18"/>
+                <w:szCs w:val="18"/>
+              </w:rPr>
+              <w:t>Sudah sesuai</w:t>
+            </w:r>
           </w:p>
         </w:tc>
       </w:tr>
@@ -6614,7 +6425,18 @@
           <w:p>
             <w:pPr>
               <w:spacing w:before="20" w:after="20" w:line="252" w:lineRule="auto"/>
-            </w:pPr>
+              <w:rPr>
+                <w:sz w:val="18"/>
+                <w:szCs w:val="18"/>
+              </w:rPr>
+            </w:pPr>
+            <w:r>
+              <w:rPr>
+                <w:sz w:val="18"/>
+                <w:szCs w:val="18"/>
+              </w:rPr>
+              <w:t>Sudah sesuai</w:t>
+            </w:r>
           </w:p>
         </w:tc>
       </w:tr>
@@ -6683,7 +6505,18 @@
           <w:p>
             <w:pPr>
               <w:spacing w:before="20" w:after="20" w:line="252" w:lineRule="auto"/>
-            </w:pPr>
+              <w:rPr>
+                <w:sz w:val="18"/>
+                <w:szCs w:val="18"/>
+              </w:rPr>
+            </w:pPr>
+            <w:r>
+              <w:rPr>
+                <w:sz w:val="18"/>
+                <w:szCs w:val="18"/>
+              </w:rPr>
+              <w:t>Sudah sesuai</w:t>
+            </w:r>
           </w:p>
         </w:tc>
       </w:tr>
@@ -6753,7 +6586,18 @@
           <w:p>
             <w:pPr>
               <w:spacing w:before="20" w:after="20" w:line="252" w:lineRule="auto"/>
-            </w:pPr>
+              <w:rPr>
+                <w:sz w:val="18"/>
+                <w:szCs w:val="18"/>
+              </w:rPr>
+            </w:pPr>
+            <w:r>
+              <w:rPr>
+                <w:sz w:val="18"/>
+                <w:szCs w:val="18"/>
+              </w:rPr>
+              <w:t>Sudah sesuai</w:t>
+            </w:r>
           </w:p>
         </w:tc>
       </w:tr>
@@ -8505,7 +8349,18 @@
           <w:p>
             <w:pPr>
               <w:spacing w:before="20" w:after="20" w:line="252" w:lineRule="auto"/>
-            </w:pPr>
+              <w:rPr>
+                <w:sz w:val="18"/>
+                <w:szCs w:val="18"/>
+              </w:rPr>
+            </w:pPr>
+            <w:r>
+              <w:rPr>
+                <w:sz w:val="18"/>
+                <w:szCs w:val="18"/>
+              </w:rPr>
+              <w:t>Sudah sesuai</w:t>
+            </w:r>
           </w:p>
         </w:tc>
       </w:tr>
@@ -8574,7 +8429,18 @@
           <w:p>
             <w:pPr>
               <w:spacing w:before="20" w:after="20" w:line="252" w:lineRule="auto"/>
-            </w:pPr>
+              <w:rPr>
+                <w:sz w:val="18"/>
+                <w:szCs w:val="18"/>
+              </w:rPr>
+            </w:pPr>
+            <w:r>
+              <w:rPr>
+                <w:sz w:val="18"/>
+                <w:szCs w:val="18"/>
+              </w:rPr>
+              <w:t>Sudah sesuai</w:t>
+            </w:r>
           </w:p>
         </w:tc>
       </w:tr>
@@ -8643,7 +8509,18 @@
           <w:p>
             <w:pPr>
               <w:spacing w:before="20" w:after="20" w:line="252" w:lineRule="auto"/>
-            </w:pPr>
+              <w:rPr>
+                <w:sz w:val="18"/>
+                <w:szCs w:val="18"/>
+              </w:rPr>
+            </w:pPr>
+            <w:r>
+              <w:rPr>
+                <w:sz w:val="18"/>
+                <w:szCs w:val="18"/>
+              </w:rPr>
+              <w:t>Sudah sesuai</w:t>
+            </w:r>
           </w:p>
         </w:tc>
       </w:tr>
@@ -8712,7 +8589,18 @@
           <w:p>
             <w:pPr>
               <w:spacing w:before="20" w:after="20" w:line="252" w:lineRule="auto"/>
-            </w:pPr>
+              <w:rPr>
+                <w:sz w:val="18"/>
+                <w:szCs w:val="18"/>
+              </w:rPr>
+            </w:pPr>
+            <w:r>
+              <w:rPr>
+                <w:sz w:val="18"/>
+                <w:szCs w:val="18"/>
+              </w:rPr>
+              <w:t>Sudah sesuai</w:t>
+            </w:r>
           </w:p>
         </w:tc>
       </w:tr>
@@ -10094,7 +9982,18 @@
           <w:p>
             <w:pPr>
               <w:spacing w:before="20" w:after="20" w:line="252" w:lineRule="auto"/>
-            </w:pPr>
+              <w:rPr>
+                <w:sz w:val="18"/>
+                <w:szCs w:val="18"/>
+              </w:rPr>
+            </w:pPr>
+            <w:r>
+              <w:rPr>
+                <w:sz w:val="18"/>
+                <w:szCs w:val="18"/>
+              </w:rPr>
+              <w:t>“Semua”</w:t>
+            </w:r>
           </w:p>
         </w:tc>
         <w:tc>
@@ -10110,7 +10009,18 @@
           <w:p>
             <w:pPr>
               <w:spacing w:before="20" w:after="20" w:line="252" w:lineRule="auto"/>
-            </w:pPr>
+              <w:rPr>
+                <w:sz w:val="18"/>
+                <w:szCs w:val="18"/>
+              </w:rPr>
+            </w:pPr>
+            <w:r>
+              <w:rPr>
+                <w:sz w:val="18"/>
+                <w:szCs w:val="18"/>
+              </w:rPr>
+              <w:t>Agar semua kategori proyek ditampilkan saat halaman pertama kali dibuka.</w:t>
+            </w:r>
           </w:p>
         </w:tc>
       </w:tr>
@@ -10156,7 +10066,18 @@
           <w:p>
             <w:pPr>
               <w:spacing w:before="20" w:after="20" w:line="252" w:lineRule="auto"/>
-            </w:pPr>
+              <w:rPr>
+                <w:sz w:val="18"/>
+                <w:szCs w:val="18"/>
+              </w:rPr>
+            </w:pPr>
+            <w:r>
+              <w:rPr>
+                <w:sz w:val="18"/>
+                <w:szCs w:val="18"/>
+              </w:rPr>
+              <w:t>[] (array kosong)</w:t>
+            </w:r>
           </w:p>
         </w:tc>
         <w:tc>
@@ -10172,7 +10093,18 @@
           <w:p>
             <w:pPr>
               <w:spacing w:before="20" w:after="20" w:line="252" w:lineRule="auto"/>
-            </w:pPr>
+              <w:rPr>
+                <w:sz w:val="18"/>
+                <w:szCs w:val="18"/>
+              </w:rPr>
+            </w:pPr>
+            <w:r>
+              <w:rPr>
+                <w:sz w:val="18"/>
+                <w:szCs w:val="18"/>
+              </w:rPr>
+              <w:t>Karena belum ada proyek yang ditandai sebagai favorit oleh pengguna.</w:t>
+            </w:r>
           </w:p>
         </w:tc>
       </w:tr>
@@ -10841,7 +10773,18 @@
           <w:p>
             <w:pPr>
               <w:spacing w:before="20" w:after="20" w:line="252" w:lineRule="auto"/>
-            </w:pPr>
+              <w:rPr>
+                <w:sz w:val="18"/>
+                <w:szCs w:val="18"/>
+              </w:rPr>
+            </w:pPr>
+            <w:r>
+              <w:rPr>
+                <w:sz w:val="18"/>
+                <w:szCs w:val="18"/>
+              </w:rPr>
+              <w:t>Ya</w:t>
+            </w:r>
           </w:p>
         </w:tc>
         <w:tc>
@@ -10857,7 +10800,18 @@
           <w:p>
             <w:pPr>
               <w:spacing w:before="20" w:after="20" w:line="252" w:lineRule="auto"/>
-            </w:pPr>
+              <w:rPr>
+                <w:sz w:val="18"/>
+                <w:szCs w:val="18"/>
+              </w:rPr>
+            </w:pPr>
+            <w:r>
+              <w:rPr>
+                <w:sz w:val="18"/>
+                <w:szCs w:val="18"/>
+              </w:rPr>
+              <w:t>Agar pilihan kategori terakhir tetap ada.</w:t>
+            </w:r>
           </w:p>
         </w:tc>
       </w:tr>
@@ -10903,7 +10857,18 @@
           <w:p>
             <w:pPr>
               <w:spacing w:before="20" w:after="20" w:line="252" w:lineRule="auto"/>
-            </w:pPr>
+              <w:rPr>
+                <w:sz w:val="18"/>
+                <w:szCs w:val="18"/>
+              </w:rPr>
+            </w:pPr>
+            <w:r>
+              <w:rPr>
+                <w:sz w:val="18"/>
+                <w:szCs w:val="18"/>
+              </w:rPr>
+              <w:t>Ya</w:t>
+            </w:r>
           </w:p>
         </w:tc>
         <w:tc>
@@ -10919,7 +10884,18 @@
           <w:p>
             <w:pPr>
               <w:spacing w:before="20" w:after="20" w:line="252" w:lineRule="auto"/>
-            </w:pPr>
+              <w:rPr>
+                <w:sz w:val="18"/>
+                <w:szCs w:val="18"/>
+              </w:rPr>
+            </w:pPr>
+            <w:r>
+              <w:rPr>
+                <w:sz w:val="18"/>
+                <w:szCs w:val="18"/>
+              </w:rPr>
+              <w:t>Agar favorit tidak hilang saat halaman dibuka kembali.</w:t>
+            </w:r>
           </w:p>
         </w:tc>
       </w:tr>
@@ -10965,7 +10941,18 @@
           <w:p>
             <w:pPr>
               <w:spacing w:before="20" w:after="20" w:line="252" w:lineRule="auto"/>
-            </w:pPr>
+              <w:rPr>
+                <w:sz w:val="18"/>
+                <w:szCs w:val="18"/>
+              </w:rPr>
+            </w:pPr>
+            <w:r>
+              <w:rPr>
+                <w:sz w:val="18"/>
+                <w:szCs w:val="18"/>
+              </w:rPr>
+              <w:t>Tidak</w:t>
+            </w:r>
           </w:p>
         </w:tc>
         <w:tc>
@@ -10981,7 +10968,18 @@
           <w:p>
             <w:pPr>
               <w:spacing w:before="20" w:after="20" w:line="252" w:lineRule="auto"/>
-            </w:pPr>
+              <w:rPr>
+                <w:sz w:val="18"/>
+                <w:szCs w:val="18"/>
+              </w:rPr>
+            </w:pPr>
+            <w:r>
+              <w:rPr>
+                <w:sz w:val="18"/>
+                <w:szCs w:val="18"/>
+              </w:rPr>
+              <w:t>Data dimuat kembali dari server melalui ambilProyek().</w:t>
+            </w:r>
           </w:p>
         </w:tc>
       </w:tr>
@@ -11027,11 +11025,16 @@
           <w:p>
             <w:pPr>
               <w:spacing w:before="20" w:after="20" w:line="252" w:lineRule="auto"/>
-            </w:pPr>
-            <w:r>
-              <w:rPr>
-                <w:rFonts w:cs="Carlito"/>
-                <w:sz w:val="18"/>
+              <w:rPr>
+                <w:sz w:val="18"/>
+                <w:szCs w:val="18"/>
+              </w:rPr>
+            </w:pPr>
+            <w:r>
+              <w:rPr>
+                <w:rFonts w:cs="Carlito"/>
+                <w:sz w:val="18"/>
+                <w:szCs w:val="18"/>
               </w:rPr>
               <w:t>Tidak</w:t>
             </w:r>
@@ -11050,11 +11053,16 @@
           <w:p>
             <w:pPr>
               <w:spacing w:before="20" w:after="20" w:line="252" w:lineRule="auto"/>
-            </w:pPr>
-            <w:r>
-              <w:rPr>
-                <w:rFonts w:cs="Carlito"/>
-                <w:sz w:val="18"/>
+              <w:rPr>
+                <w:sz w:val="18"/>
+                <w:szCs w:val="18"/>
+              </w:rPr>
+            </w:pPr>
+            <w:r>
+              <w:rPr>
+                <w:rFonts w:cs="Carlito"/>
+                <w:sz w:val="18"/>
+                <w:szCs w:val="18"/>
               </w:rPr>
               <w:t>Tidak terenkripsi dan bisa dibaca siapa pun</w:t>
             </w:r>
@@ -12203,7 +12211,34 @@
           <w:p>
             <w:pPr>
               <w:spacing w:before="20" w:after="20" w:line="252" w:lineRule="auto"/>
-            </w:pPr>
+              <w:rPr>
+                <w:sz w:val="18"/>
+                <w:szCs w:val="18"/>
+              </w:rPr>
+            </w:pPr>
+            <w:r>
+              <w:rPr>
+                <w:sz w:val="18"/>
+                <w:szCs w:val="18"/>
+              </w:rPr>
+              <w:t xml:space="preserve">Untuk hasil pertama galat “undifined”. Dan kemudian di refersh dan dicoba dengan </w:t>
+            </w:r>
+            <w:r>
+              <w:rPr>
+                <w:rFonts w:cs="Carlito"/>
+                <w:sz w:val="18"/>
+                <w:szCs w:val="18"/>
+              </w:rPr>
+              <w:t xml:space="preserve">localStorage.getItem("pabw-p11") </w:t>
+            </w:r>
+            <w:r>
+              <w:rPr>
+                <w:rFonts w:cs="Carlito"/>
+                <w:sz w:val="18"/>
+                <w:szCs w:val="18"/>
+              </w:rPr>
+              <w:t>, maka hasilnya “Null”</w:t>
+            </w:r>
           </w:p>
         </w:tc>
       </w:tr>
@@ -12232,6 +12267,7 @@
                 <w:rFonts w:cs="Carlito"/>
                 <w:sz w:val="18"/>
               </w:rPr>
+              <w:lastRenderedPageBreak/>
               <w:t>localStorage.setItem("pabw-p11", "{}")</w:t>
             </w:r>
           </w:p>
@@ -12272,7 +12308,26 @@
           <w:p>
             <w:pPr>
               <w:spacing w:before="20" w:after="20" w:line="252" w:lineRule="auto"/>
-            </w:pPr>
+              <w:rPr>
+                <w:sz w:val="18"/>
+                <w:szCs w:val="18"/>
+              </w:rPr>
+            </w:pPr>
+            <w:r>
+              <w:rPr>
+                <w:sz w:val="18"/>
+                <w:szCs w:val="18"/>
+              </w:rPr>
+              <w:t xml:space="preserve">Untuk hasil pertama galat “undifined”. Dan kemudian di refersh dan dicoba dengan </w:t>
+            </w:r>
+            <w:r>
+              <w:rPr>
+                <w:rFonts w:cs="Carlito"/>
+                <w:sz w:val="18"/>
+                <w:szCs w:val="18"/>
+              </w:rPr>
+              <w:t>localStorage.getItem("pabw-p11") , maka hasilnya “Null”</w:t>
+            </w:r>
           </w:p>
         </w:tc>
       </w:tr>
@@ -12341,7 +12396,18 @@
           <w:p>
             <w:pPr>
               <w:spacing w:before="20" w:after="20" w:line="252" w:lineRule="auto"/>
-            </w:pPr>
+              <w:rPr>
+                <w:sz w:val="18"/>
+                <w:szCs w:val="18"/>
+              </w:rPr>
+            </w:pPr>
+            <w:r>
+              <w:rPr>
+                <w:sz w:val="18"/>
+                <w:szCs w:val="18"/>
+              </w:rPr>
+              <w:t>Hasil “Null”</w:t>
+            </w:r>
           </w:p>
         </w:tc>
       </w:tr>
@@ -12362,7 +12428,6 @@
           <w:b/>
           <w:color w:val="003796"/>
         </w:rPr>
-        <w:lastRenderedPageBreak/>
         <w:t>E.4  Catatan: apa yang sengaja tidak saya simpan</w:t>
       </w:r>
     </w:p>
@@ -12455,7 +12520,18 @@
           <w:p>
             <w:pPr>
               <w:spacing w:before="20" w:after="20" w:line="252" w:lineRule="auto"/>
-            </w:pPr>
+              <w:rPr>
+                <w:sz w:val="18"/>
+                <w:szCs w:val="18"/>
+              </w:rPr>
+            </w:pPr>
+            <w:r>
+              <w:rPr>
+                <w:sz w:val="18"/>
+                <w:szCs w:val="18"/>
+              </w:rPr>
+              <w:t>Token dan kata sandi</w:t>
+            </w:r>
           </w:p>
         </w:tc>
         <w:tc>
@@ -12471,53 +12547,18 @@
           <w:p>
             <w:pPr>
               <w:spacing w:before="20" w:after="20" w:line="252" w:lineRule="auto"/>
-            </w:pPr>
-            <w:r>
-              <w:rPr>
-                <w:rFonts w:cs="Carlito"/>
-                <w:sz w:val="19"/>
-              </w:rPr>
-              <w:t>Token dan kata sandi tidak terenkripsi di peramban</w:t>
-            </w:r>
-          </w:p>
-        </w:tc>
-      </w:tr>
-      <w:tr>
-        <w:trPr>
-          <w:cantSplit/>
-          <w:trHeight w:val="198"/>
-          <w:jc w:val="center"/>
-        </w:trPr>
-        <w:tc>
-          <w:tcPr>
-            <w:tcW w:w="3600" w:type="dxa"/>
-            <w:tcBorders>
-              <w:top w:val="single" w:sz="6" w:space="0" w:color="D8DEE9"/>
-              <w:left w:val="single" w:sz="6" w:space="0" w:color="D8DEE9"/>
-              <w:bottom w:val="single" w:sz="6" w:space="0" w:color="D8DEE9"/>
-              <w:right w:val="single" w:sz="6" w:space="0" w:color="D8DEE9"/>
-            </w:tcBorders>
-          </w:tcPr>
-          <w:p>
-            <w:pPr>
-              <w:spacing w:before="20" w:after="20" w:line="252" w:lineRule="auto"/>
-            </w:pPr>
-          </w:p>
-        </w:tc>
-        <w:tc>
-          <w:tcPr>
-            <w:tcW w:w="6151" w:type="dxa"/>
-            <w:tcBorders>
-              <w:top w:val="single" w:sz="6" w:space="0" w:color="D8DEE9"/>
-              <w:left w:val="single" w:sz="6" w:space="0" w:color="D8DEE9"/>
-              <w:bottom w:val="single" w:sz="6" w:space="0" w:color="D8DEE9"/>
-              <w:right w:val="single" w:sz="6" w:space="0" w:color="D8DEE9"/>
-            </w:tcBorders>
-          </w:tcPr>
-          <w:p>
-            <w:pPr>
-              <w:spacing w:before="20" w:after="20" w:line="252" w:lineRule="auto"/>
-            </w:pPr>
+              <w:rPr>
+                <w:sz w:val="18"/>
+                <w:szCs w:val="18"/>
+              </w:rPr>
+            </w:pPr>
+            <w:r>
+              <w:rPr>
+                <w:sz w:val="18"/>
+                <w:szCs w:val="18"/>
+              </w:rPr>
+              <w:t>Tidak terenkripsi di peramban sehingga dapat dibaca oleh orang yang menggunakan komputer tersebut.</w:t>
+            </w:r>
           </w:p>
         </w:tc>
       </w:tr>
@@ -12941,11 +12982,16 @@
       <w:pPr>
         <w:keepNext/>
         <w:spacing w:after="80"/>
+        <w:rPr>
+          <w:sz w:val="20"/>
+          <w:szCs w:val="20"/>
+        </w:rPr>
       </w:pPr>
       <w:r>
         <w:rPr>
           <w:rFonts w:cs="Carlito"/>
           <w:sz w:val="20"/>
+          <w:szCs w:val="20"/>
         </w:rPr>
         <w:t>1.  Sebutkan satu berkas yang Anda buat hari ini, tanggung jawabnya, dan dua berkas lain yang mengimpornya.</w:t>
       </w:r>
@@ -12973,41 +13019,47 @@
               <w:right w:val="single" w:sz="4" w:space="0" w:color="B9C6E2"/>
             </w:tcBorders>
           </w:tcPr>
-          <w:p/>
-        </w:tc>
-      </w:tr>
-      <w:tr>
-        <w:trPr>
-          <w:trHeight w:val="351"/>
-        </w:trPr>
-        <w:tc>
-          <w:tcPr>
-            <w:tcW w:w="9751" w:type="dxa"/>
-            <w:tcBorders>
-              <w:top w:val="single" w:sz="4" w:space="0" w:color="B9C6E2"/>
-              <w:left w:val="single" w:sz="4" w:space="0" w:color="B9C6E2"/>
-              <w:bottom w:val="single" w:sz="4" w:space="0" w:color="B9C6E2"/>
-              <w:right w:val="single" w:sz="4" w:space="0" w:color="B9C6E2"/>
-            </w:tcBorders>
-          </w:tcPr>
-          <w:p/>
+          <w:p>
+            <w:pPr>
+              <w:rPr>
+                <w:sz w:val="20"/>
+                <w:szCs w:val="20"/>
+              </w:rPr>
+            </w:pPr>
+            <w:r>
+              <w:rPr>
+                <w:sz w:val="20"/>
+                <w:szCs w:val="20"/>
+              </w:rPr>
+              <w:t>state.js mengelola state dan penyimpanan; app.js dan events.js mengimpor fungsi-fungsinya.</w:t>
+            </w:r>
+          </w:p>
         </w:tc>
       </w:tr>
     </w:tbl>
     <w:p>
       <w:pPr>
         <w:spacing w:after="60"/>
+        <w:rPr>
+          <w:sz w:val="20"/>
+          <w:szCs w:val="20"/>
+        </w:rPr>
       </w:pPr>
     </w:p>
     <w:p>
       <w:pPr>
         <w:keepNext/>
         <w:spacing w:after="80"/>
+        <w:rPr>
+          <w:sz w:val="20"/>
+          <w:szCs w:val="20"/>
+        </w:rPr>
       </w:pPr>
       <w:r>
         <w:rPr>
           <w:rFonts w:cs="Carlito"/>
           <w:sz w:val="20"/>
+          <w:szCs w:val="20"/>
         </w:rPr>
         <w:t>2.  Mengapa jalur import wajib berawalan ./ dan berakhiran .js? Apa yang muncul di Console bila keduanya dilewatkan?</w:t>
       </w:r>
@@ -13035,41 +13087,47 @@
               <w:right w:val="single" w:sz="4" w:space="0" w:color="B9C6E2"/>
             </w:tcBorders>
           </w:tcPr>
-          <w:p/>
-        </w:tc>
-      </w:tr>
-      <w:tr>
-        <w:trPr>
-          <w:trHeight w:val="351"/>
-        </w:trPr>
-        <w:tc>
-          <w:tcPr>
-            <w:tcW w:w="9751" w:type="dxa"/>
-            <w:tcBorders>
-              <w:top w:val="single" w:sz="4" w:space="0" w:color="B9C6E2"/>
-              <w:left w:val="single" w:sz="4" w:space="0" w:color="B9C6E2"/>
-              <w:bottom w:val="single" w:sz="4" w:space="0" w:color="B9C6E2"/>
-              <w:right w:val="single" w:sz="4" w:space="0" w:color="B9C6E2"/>
-            </w:tcBorders>
-          </w:tcPr>
-          <w:p/>
+          <w:p>
+            <w:pPr>
+              <w:rPr>
+                <w:sz w:val="20"/>
+                <w:szCs w:val="20"/>
+              </w:rPr>
+            </w:pPr>
+            <w:r>
+              <w:rPr>
+                <w:sz w:val="20"/>
+                <w:szCs w:val="20"/>
+              </w:rPr>
+              <w:t>./ menunjukkan jalur relatif, sedangkan .js menunjukkan berkas modul; jika tidak sesuai, Console dapat menampilkan galat resolusi modul.</w:t>
+            </w:r>
+          </w:p>
         </w:tc>
       </w:tr>
     </w:tbl>
     <w:p>
       <w:pPr>
         <w:spacing w:after="60"/>
+        <w:rPr>
+          <w:sz w:val="20"/>
+          <w:szCs w:val="20"/>
+        </w:rPr>
       </w:pPr>
     </w:p>
     <w:p>
       <w:pPr>
         <w:keepNext/>
         <w:spacing w:after="80"/>
+        <w:rPr>
+          <w:sz w:val="20"/>
+          <w:szCs w:val="20"/>
+        </w:rPr>
       </w:pPr>
       <w:r>
         <w:rPr>
           <w:rFonts w:cs="Carlito"/>
           <w:sz w:val="20"/>
+          <w:szCs w:val="20"/>
         </w:rPr>
         <w:t>3.  Sebelum hari ini, di mana keadaan kategori aktif disimpan? Mengapa cara itu akhirnya kacau saat daftar digambar ulang?</w:t>
       </w:r>
@@ -13097,41 +13155,47 @@
               <w:right w:val="single" w:sz="4" w:space="0" w:color="B9C6E2"/>
             </w:tcBorders>
           </w:tcPr>
-          <w:p/>
-        </w:tc>
-      </w:tr>
-      <w:tr>
-        <w:trPr>
-          <w:trHeight w:val="351"/>
-        </w:trPr>
-        <w:tc>
-          <w:tcPr>
-            <w:tcW w:w="9751" w:type="dxa"/>
-            <w:tcBorders>
-              <w:top w:val="single" w:sz="4" w:space="0" w:color="B9C6E2"/>
-              <w:left w:val="single" w:sz="4" w:space="0" w:color="B9C6E2"/>
-              <w:bottom w:val="single" w:sz="4" w:space="0" w:color="B9C6E2"/>
-              <w:right w:val="single" w:sz="4" w:space="0" w:color="B9C6E2"/>
-            </w:tcBorders>
-          </w:tcPr>
-          <w:p/>
+          <w:p>
+            <w:pPr>
+              <w:rPr>
+                <w:sz w:val="20"/>
+                <w:szCs w:val="20"/>
+              </w:rPr>
+            </w:pPr>
+            <w:r>
+              <w:rPr>
+                <w:sz w:val="20"/>
+                <w:szCs w:val="20"/>
+              </w:rPr>
+              <w:t>Kategori aktif tersimpan pada elemen DOM; ketika DOM digambar ulang, elemen dan keadaan sebelumnya bisa hilang atau tidak sinkron.</w:t>
+            </w:r>
+          </w:p>
         </w:tc>
       </w:tr>
     </w:tbl>
     <w:p>
       <w:pPr>
         <w:spacing w:after="60"/>
+        <w:rPr>
+          <w:sz w:val="20"/>
+          <w:szCs w:val="20"/>
+        </w:rPr>
       </w:pPr>
     </w:p>
     <w:p>
       <w:pPr>
         <w:keepNext/>
         <w:spacing w:after="80"/>
+        <w:rPr>
+          <w:sz w:val="20"/>
+          <w:szCs w:val="20"/>
+        </w:rPr>
       </w:pPr>
       <w:r>
         <w:rPr>
           <w:rFonts w:cs="Carlito"/>
           <w:sz w:val="20"/>
+          <w:szCs w:val="20"/>
         </w:rPr>
         <w:t>4.  Apa yang harus dilakukan sebelum dipakai, ketika getItem mengembalikan null pada kunjungan pertama?</w:t>
       </w:r>
@@ -13159,41 +13223,47 @@
               <w:right w:val="single" w:sz="4" w:space="0" w:color="B9C6E2"/>
             </w:tcBorders>
           </w:tcPr>
-          <w:p/>
-        </w:tc>
-      </w:tr>
-      <w:tr>
-        <w:trPr>
-          <w:trHeight w:val="351"/>
-        </w:trPr>
-        <w:tc>
-          <w:tcPr>
-            <w:tcW w:w="9751" w:type="dxa"/>
-            <w:tcBorders>
-              <w:top w:val="single" w:sz="4" w:space="0" w:color="B9C6E2"/>
-              <w:left w:val="single" w:sz="4" w:space="0" w:color="B9C6E2"/>
-              <w:bottom w:val="single" w:sz="4" w:space="0" w:color="B9C6E2"/>
-              <w:right w:val="single" w:sz="4" w:space="0" w:color="B9C6E2"/>
-            </w:tcBorders>
-          </w:tcPr>
-          <w:p/>
+          <w:p>
+            <w:pPr>
+              <w:rPr>
+                <w:sz w:val="20"/>
+                <w:szCs w:val="20"/>
+              </w:rPr>
+            </w:pPr>
+            <w:r>
+              <w:rPr>
+                <w:sz w:val="20"/>
+                <w:szCs w:val="20"/>
+              </w:rPr>
+              <w:t>Gunakan nilai bawaan, misalnya kategoriAktif = "semua" dan favorit = [].</w:t>
+            </w:r>
+          </w:p>
         </w:tc>
       </w:tr>
     </w:tbl>
     <w:p>
       <w:pPr>
         <w:spacing w:after="60"/>
+        <w:rPr>
+          <w:sz w:val="20"/>
+          <w:szCs w:val="20"/>
+        </w:rPr>
       </w:pPr>
     </w:p>
     <w:p>
       <w:pPr>
         <w:keepNext/>
         <w:spacing w:after="80"/>
+        <w:rPr>
+          <w:sz w:val="20"/>
+          <w:szCs w:val="20"/>
+        </w:rPr>
       </w:pPr>
       <w:r>
         <w:rPr>
           <w:rFonts w:cs="Carlito"/>
           <w:sz w:val="20"/>
+          <w:szCs w:val="20"/>
         </w:rPr>
         <w:t>5.  Mengapa simpanan yang rusak harus tetap membuat halaman terbuka? Tulis cara Anda menanganinya.</w:t>
       </w:r>
@@ -13221,41 +13291,47 @@
               <w:right w:val="single" w:sz="4" w:space="0" w:color="B9C6E2"/>
             </w:tcBorders>
           </w:tcPr>
-          <w:p/>
-        </w:tc>
-      </w:tr>
-      <w:tr>
-        <w:trPr>
-          <w:trHeight w:val="351"/>
-        </w:trPr>
-        <w:tc>
-          <w:tcPr>
-            <w:tcW w:w="9751" w:type="dxa"/>
-            <w:tcBorders>
-              <w:top w:val="single" w:sz="4" w:space="0" w:color="B9C6E2"/>
-              <w:left w:val="single" w:sz="4" w:space="0" w:color="B9C6E2"/>
-              <w:bottom w:val="single" w:sz="4" w:space="0" w:color="B9C6E2"/>
-              <w:right w:val="single" w:sz="4" w:space="0" w:color="B9C6E2"/>
-            </w:tcBorders>
-          </w:tcPr>
-          <w:p/>
+          <w:p>
+            <w:pPr>
+              <w:rPr>
+                <w:sz w:val="20"/>
+                <w:szCs w:val="20"/>
+              </w:rPr>
+            </w:pPr>
+            <w:r>
+              <w:rPr>
+                <w:sz w:val="20"/>
+                <w:szCs w:val="20"/>
+              </w:rPr>
+              <w:t>Simpanan rusak tidak boleh membuat halaman berhenti karena aplikasi harus tetap dapat digunakan. Saya menanganinya dengan try...catch, menghapus simpanan yang rusak menggunakan localStorage.removeItem(), lalu memakai nilai bawaan.</w:t>
+            </w:r>
+          </w:p>
         </w:tc>
       </w:tr>
     </w:tbl>
     <w:p>
       <w:pPr>
         <w:spacing w:after="60"/>
+        <w:rPr>
+          <w:sz w:val="20"/>
+          <w:szCs w:val="20"/>
+        </w:rPr>
       </w:pPr>
     </w:p>
     <w:p>
       <w:pPr>
         <w:keepNext/>
         <w:spacing w:after="80"/>
+        <w:rPr>
+          <w:sz w:val="20"/>
+          <w:szCs w:val="20"/>
+        </w:rPr>
       </w:pPr>
       <w:r>
         <w:rPr>
           <w:rFonts w:cs="Carlito"/>
           <w:sz w:val="20"/>
+          <w:szCs w:val="20"/>
         </w:rPr>
         <w:t>6.  Sebutkan satu hal yang bisa Anda simpan di localStorage dan satu hal yang tidak boleh. Jelaskan bedanya.</w:t>
       </w:r>
@@ -13283,24 +13359,21 @@
               <w:right w:val="single" w:sz="4" w:space="0" w:color="B9C6E2"/>
             </w:tcBorders>
           </w:tcPr>
-          <w:p/>
-        </w:tc>
-      </w:tr>
-      <w:tr>
-        <w:trPr>
-          <w:trHeight w:val="351"/>
-        </w:trPr>
-        <w:tc>
-          <w:tcPr>
-            <w:tcW w:w="9751" w:type="dxa"/>
-            <w:tcBorders>
-              <w:top w:val="single" w:sz="4" w:space="0" w:color="B9C6E2"/>
-              <w:left w:val="single" w:sz="4" w:space="0" w:color="B9C6E2"/>
-              <w:bottom w:val="single" w:sz="4" w:space="0" w:color="B9C6E2"/>
-              <w:right w:val="single" w:sz="4" w:space="0" w:color="B9C6E2"/>
-            </w:tcBorders>
-          </w:tcPr>
-          <w:p/>
+          <w:p>
+            <w:pPr>
+              <w:rPr>
+                <w:sz w:val="20"/>
+                <w:szCs w:val="20"/>
+              </w:rPr>
+            </w:pPr>
+            <w:r>
+              <w:rPr>
+                <w:sz w:val="20"/>
+                <w:szCs w:val="20"/>
+              </w:rPr>
+              <w:t>Saya dapat menyimpan kategori aktif di localStorage agar pilihan tetap tersimpan setelah halaman dimuat ulang. Saya tidak menyimpan kata sandi karena data localStorage tidak terenkripsi secara otomatis sehingga berisiko dibaca pihak lain.</w:t>
+            </w:r>
+          </w:p>
         </w:tc>
       </w:tr>
     </w:tbl>
@@ -13358,11 +13431,19 @@
             </w:pPr>
             <w:r>
               <w:rPr>
+                <w:rFonts w:ascii="Segoe UI Symbol" w:hAnsi="Segoe UI Symbol" w:cs="Segoe UI Symbol"/>
+                <w:sz w:val="19"/>
+                <w:szCs w:val="19"/>
+              </w:rPr>
+              <w:t>☑</w:t>
+            </w:r>
+            <w:r>
+              <w:rPr>
                 <w:rFonts w:cs="Carlito"/>
                 <w:color w:val="003796"/>
                 <w:sz w:val="22"/>
               </w:rPr>
-              <w:t>☐  Berkas  lima modul ada di repositori: data.js, state.js, dom.js, events.js, app.js — ditambah js/api.js dari P10</w:t>
+              <w:t xml:space="preserve"> Berkas  lima modul ada di repositori: data.js, state.js, dom.js, events.js, app.js — ditambah js/api.js dari P10</w:t>
             </w:r>
           </w:p>
         </w:tc>
@@ -13384,11 +13465,19 @@
             </w:pPr>
             <w:r>
               <w:rPr>
+                <w:rFonts w:ascii="Segoe UI Symbol" w:hAnsi="Segoe UI Symbol" w:cs="Segoe UI Symbol"/>
+                <w:sz w:val="19"/>
+                <w:szCs w:val="19"/>
+              </w:rPr>
+              <w:t>☑</w:t>
+            </w:r>
+            <w:r>
+              <w:rPr>
                 <w:rFonts w:cs="Carlito"/>
                 <w:color w:val="003796"/>
                 <w:sz w:val="22"/>
               </w:rPr>
-              <w:t>☐  Impor  seluruh jalur berawalan ./ dan berakhiran .js; Console bersih tanpa satu pun galat impor</w:t>
+              <w:t xml:space="preserve">  Impor  seluruh jalur berawalan ./ dan berakhiran .js; Console bersih tanpa satu pun galat impor</w:t>
             </w:r>
           </w:p>
         </w:tc>
@@ -13410,11 +13499,19 @@
             </w:pPr>
             <w:r>
               <w:rPr>
+                <w:rFonts w:ascii="Segoe UI Symbol" w:hAnsi="Segoe UI Symbol" w:cs="Segoe UI Symbol"/>
+                <w:sz w:val="19"/>
+                <w:szCs w:val="19"/>
+              </w:rPr>
+              <w:t>☑</w:t>
+            </w:r>
+            <w:r>
+              <w:rPr>
                 <w:rFonts w:cs="Carlito"/>
                 <w:color w:val="003796"/>
                 <w:sz w:val="22"/>
               </w:rPr>
-              <w:t>☐  Perilaku  halaman bekerja persis seperti akhir Pertemuan 10, ditambah tombol favorit; tidak ada fitur lain yang ditambahkan</w:t>
+              <w:t xml:space="preserve">  Perilaku  halaman bekerja persis seperti akhir Pertemuan 10, ditambah tombol favorit; tidak ada fitur lain yang ditambahkan</w:t>
             </w:r>
           </w:p>
         </w:tc>
@@ -13436,20 +13533,19 @@
             </w:pPr>
             <w:r>
               <w:rPr>
+                <w:rFonts w:ascii="Segoe UI Symbol" w:hAnsi="Segoe UI Symbol" w:cs="Segoe UI Symbol"/>
+                <w:sz w:val="19"/>
+                <w:szCs w:val="19"/>
+              </w:rPr>
+              <w:t>☑</w:t>
+            </w:r>
+            <w:r>
+              <w:rPr>
                 <w:rFonts w:cs="Carlito"/>
                 <w:color w:val="003796"/>
                 <w:sz w:val="22"/>
               </w:rPr>
-              <w:t xml:space="preserve">☐  State  seluruh keadaan yang bisa berubah berada di satu objek state, dan tidak ada keadaan yang </w:t>
-            </w:r>
-            <w:r>
-              <w:rPr>
-                <w:rFonts w:cs="Carlito"/>
-                <w:color w:val="003796"/>
-                <w:sz w:val="22"/>
-              </w:rPr>
-              <w:lastRenderedPageBreak/>
-              <w:t>dibaca kembali dari DOM</w:t>
+              <w:t xml:space="preserve">  State  seluruh keadaan yang bisa berubah berada di satu objek state, dan tidak ada keadaan yang dibaca kembali dari DOM</w:t>
             </w:r>
           </w:p>
         </w:tc>
@@ -13471,12 +13567,19 @@
             </w:pPr>
             <w:r>
               <w:rPr>
+                <w:rFonts w:ascii="Segoe UI Symbol" w:hAnsi="Segoe UI Symbol" w:cs="Segoe UI Symbol"/>
+                <w:sz w:val="19"/>
+                <w:szCs w:val="19"/>
+              </w:rPr>
+              <w:t>☑</w:t>
+            </w:r>
+            <w:r>
+              <w:rPr>
                 <w:rFonts w:cs="Carlito"/>
                 <w:color w:val="003796"/>
                 <w:sz w:val="22"/>
               </w:rPr>
-              <w:lastRenderedPageBreak/>
-              <w:t>☐  Pengubah  setiap perubahan keadaan ditulis sebagai fungsi bernama di state.js, dan fungsi itulah yang memanggil render</w:t>
+              <w:t xml:space="preserve">  Pengubah  setiap perubahan keadaan ditulis sebagai fungsi bernama di state.js, dan fungsi itulah yang memanggil render</w:t>
             </w:r>
           </w:p>
         </w:tc>
@@ -13498,11 +13601,20 @@
             </w:pPr>
             <w:r>
               <w:rPr>
+                <w:rFonts w:ascii="Segoe UI Symbol" w:hAnsi="Segoe UI Symbol" w:cs="Segoe UI Symbol"/>
+                <w:sz w:val="19"/>
+                <w:szCs w:val="19"/>
+              </w:rPr>
+              <w:lastRenderedPageBreak/>
+              <w:t>☑</w:t>
+            </w:r>
+            <w:r>
+              <w:rPr>
                 <w:rFonts w:cs="Carlito"/>
                 <w:color w:val="003796"/>
                 <w:sz w:val="22"/>
               </w:rPr>
-              <w:t>☐  Simpanan  pilihan bertahan setelah tab ditutup; JSON dipakai; nilai bawaan terpasang; tombol atur ulang bekerja</w:t>
+              <w:t xml:space="preserve">  Simpanan  pilihan bertahan setelah tab ditutup; JSON dipakai; nilai bawaan terpasang; tombol atur ulang bekerja</w:t>
             </w:r>
           </w:p>
         </w:tc>
@@ -13524,11 +13636,19 @@
             </w:pPr>
             <w:r>
               <w:rPr>
+                <w:rFonts w:ascii="Segoe UI Symbol" w:hAnsi="Segoe UI Symbol" w:cs="Segoe UI Symbol"/>
+                <w:sz w:val="19"/>
+                <w:szCs w:val="19"/>
+              </w:rPr>
+              <w:t>☑</w:t>
+            </w:r>
+            <w:r>
+              <w:rPr>
                 <w:rFonts w:cs="Carlito"/>
                 <w:color w:val="003796"/>
                 <w:sz w:val="22"/>
               </w:rPr>
-              <w:t>☐  Simpanan rusak  try/catch dipakai, nomor versi diperiksa, dan saya sudah mencoba merusaknya sendiri dari Console</w:t>
+              <w:t xml:space="preserve">  Simpanan rusak  try/catch dipakai, nomor versi diperiksa, dan saya sudah mencoba merusaknya sendiri dari Console</w:t>
             </w:r>
           </w:p>
         </w:tc>
@@ -13550,11 +13670,19 @@
             </w:pPr>
             <w:r>
               <w:rPr>
+                <w:rFonts w:ascii="Segoe UI Symbol" w:hAnsi="Segoe UI Symbol" w:cs="Segoe UI Symbol"/>
+                <w:sz w:val="19"/>
+                <w:szCs w:val="19"/>
+              </w:rPr>
+              <w:t>☑</w:t>
+            </w:r>
+            <w:r>
+              <w:rPr>
                 <w:rFonts w:cs="Carlito"/>
                 <w:color w:val="003796"/>
                 <w:sz w:val="22"/>
               </w:rPr>
-              <w:t>☐  Deklarasi AI  bagian README menyebutkan bagian mana yang dibantu AI dan bagian mana yang saya kerjakan sendiri</w:t>
+              <w:t xml:space="preserve"> Deklarasi AI  bagian README menyebutkan bagian mana yang dibantu AI dan bagian mana yang saya kerjakan sendiri</w:t>
             </w:r>
           </w:p>
         </w:tc>
@@ -13576,11 +13704,19 @@
             </w:pPr>
             <w:r>
               <w:rPr>
+                <w:rFonts w:ascii="Segoe UI Symbol" w:hAnsi="Segoe UI Symbol" w:cs="Segoe UI Symbol"/>
+                <w:sz w:val="19"/>
+                <w:szCs w:val="19"/>
+              </w:rPr>
+              <w:t>☑</w:t>
+            </w:r>
+            <w:r>
+              <w:rPr>
                 <w:rFonts w:cs="Carlito"/>
                 <w:color w:val="003796"/>
                 <w:sz w:val="22"/>
               </w:rPr>
-              <w:t>☐  Git  ada lebih dari satu commit hari ini, dan pesan commit-nya menjelaskan isinya</w:t>
+              <w:t xml:space="preserve"> Git  ada lebih dari satu commit hari ini, dan pesan commit-nya menjelaskan isinya</w:t>
             </w:r>
           </w:p>
         </w:tc>
@@ -13783,7 +13919,18 @@
           <w:p>
             <w:pPr>
               <w:spacing w:before="20" w:after="20" w:line="252" w:lineRule="auto"/>
-            </w:pPr>
+              <w:rPr>
+                <w:sz w:val="18"/>
+                <w:szCs w:val="18"/>
+              </w:rPr>
+            </w:pPr>
+            <w:r>
+              <w:rPr>
+                <w:sz w:val="18"/>
+                <w:szCs w:val="18"/>
+              </w:rPr>
+              <w:t>V24.22.0</w:t>
+            </w:r>
           </w:p>
         </w:tc>
         <w:tc>
@@ -13799,7 +13946,18 @@
           <w:p>
             <w:pPr>
               <w:spacing w:before="20" w:after="20" w:line="252" w:lineRule="auto"/>
-            </w:pPr>
+              <w:rPr>
+                <w:sz w:val="18"/>
+                <w:szCs w:val="18"/>
+              </w:rPr>
+            </w:pPr>
+            <w:r>
+              <w:rPr>
+                <w:sz w:val="18"/>
+                <w:szCs w:val="18"/>
+              </w:rPr>
+              <w:t>Berhasil</w:t>
+            </w:r>
           </w:p>
         </w:tc>
       </w:tr>
@@ -13850,7 +14008,18 @@
           <w:p>
             <w:pPr>
               <w:spacing w:before="20" w:after="20" w:line="252" w:lineRule="auto"/>
-            </w:pPr>
+              <w:rPr>
+                <w:sz w:val="18"/>
+                <w:szCs w:val="18"/>
+              </w:rPr>
+            </w:pPr>
+            <w:r>
+              <w:rPr>
+                <w:sz w:val="18"/>
+                <w:szCs w:val="18"/>
+              </w:rPr>
+              <w:t>10.9.2</w:t>
+            </w:r>
           </w:p>
         </w:tc>
         <w:tc>
@@ -13866,7 +14035,18 @@
           <w:p>
             <w:pPr>
               <w:spacing w:before="20" w:after="20" w:line="252" w:lineRule="auto"/>
-            </w:pPr>
+              <w:rPr>
+                <w:sz w:val="18"/>
+                <w:szCs w:val="18"/>
+              </w:rPr>
+            </w:pPr>
+            <w:r>
+              <w:rPr>
+                <w:sz w:val="18"/>
+                <w:szCs w:val="18"/>
+              </w:rPr>
+              <w:t>Karena menggunakan perintah npm -v gagal, jadi saya menggunakan perintah npm.cmd -v. sehingga didapat hasil versi npm tersebut.</w:t>
+            </w:r>
           </w:p>
         </w:tc>
       </w:tr>
@@ -13922,24 +14102,15 @@
               <w:right w:val="single" w:sz="4" w:space="0" w:color="B9C6E2"/>
             </w:tcBorders>
           </w:tcPr>
-          <w:p/>
-        </w:tc>
-      </w:tr>
-      <w:tr>
-        <w:trPr>
-          <w:trHeight w:val="351"/>
-        </w:trPr>
-        <w:tc>
-          <w:tcPr>
-            <w:tcW w:w="9751" w:type="dxa"/>
-            <w:tcBorders>
-              <w:top w:val="single" w:sz="4" w:space="0" w:color="B9C6E2"/>
-              <w:left w:val="single" w:sz="4" w:space="0" w:color="B9C6E2"/>
-              <w:bottom w:val="single" w:sz="4" w:space="0" w:color="B9C6E2"/>
-              <w:right w:val="single" w:sz="4" w:space="0" w:color="B9C6E2"/>
-            </w:tcBorders>
-          </w:tcPr>
-          <w:p/>
+          <w:p>
+            <w:r>
+              <w:rPr>
+                <w:sz w:val="20"/>
+                <w:szCs w:val="20"/>
+              </w:rPr>
+              <w:t>Mengatur state, localStorage, dan penanganan simpanan rusak agar halaman tetap berjalan.</w:t>
+            </w:r>
+          </w:p>
         </w:tc>
       </w:tr>
     </w:tbl>
@@ -13997,11 +14168,19 @@
             </w:pPr>
             <w:r>
               <w:rPr>
+                <w:rFonts w:ascii="Segoe UI Symbol" w:hAnsi="Segoe UI Symbol" w:cs="Segoe UI Symbol"/>
+                <w:sz w:val="19"/>
+                <w:szCs w:val="19"/>
+              </w:rPr>
+              <w:t>☑</w:t>
+            </w:r>
+            <w:r>
+              <w:rPr>
                 <w:rFonts w:cs="Carlito"/>
                 <w:color w:val="003796"/>
                 <w:sz w:val="22"/>
               </w:rPr>
-              <w:t>☐  Pengungkapan AI  README menyebutkan bagian mana yang dibantu AI dan bagian mana yang saya kerjakan sendiri</w:t>
+              <w:t xml:space="preserve">  Pengungkapan AI  README menyebutkan bagian mana yang dibantu AI dan bagian mana yang saya kerjakan sendiri</w:t>
             </w:r>
           </w:p>
         </w:tc>
@@ -14023,11 +14202,19 @@
             </w:pPr>
             <w:r>
               <w:rPr>
+                <w:rFonts w:ascii="Segoe UI Symbol" w:hAnsi="Segoe UI Symbol" w:cs="Segoe UI Symbol"/>
+                <w:sz w:val="19"/>
+                <w:szCs w:val="19"/>
+              </w:rPr>
+              <w:t>☑</w:t>
+            </w:r>
+            <w:r>
+              <w:rPr>
                 <w:rFonts w:cs="Carlito"/>
                 <w:color w:val="003796"/>
                 <w:sz w:val="22"/>
               </w:rPr>
-              <w:t>☐  Keaslian  topik dan isi halaman ini milik saya sendiri, tidak menyalin pekerjaan mahasiswa lain</w:t>
+              <w:t xml:space="preserve">  Keaslian  topik dan isi halaman ini milik saya sendiri, tidak menyalin pekerjaan mahasiswa lain</w:t>
             </w:r>
           </w:p>
         </w:tc>
@@ -14227,7 +14414,18 @@
           <w:p>
             <w:pPr>
               <w:spacing w:before="20" w:after="20" w:line="252" w:lineRule="auto"/>
-            </w:pPr>
+              <w:rPr>
+                <w:sz w:val="18"/>
+                <w:szCs w:val="18"/>
+              </w:rPr>
+            </w:pPr>
+            <w:r>
+              <w:rPr>
+                <w:sz w:val="18"/>
+                <w:szCs w:val="18"/>
+              </w:rPr>
+              <w:t>25</w:t>
+            </w:r>
           </w:p>
         </w:tc>
         <w:tc>
@@ -14243,7 +14441,18 @@
           <w:p>
             <w:pPr>
               <w:spacing w:before="20" w:after="20" w:line="252" w:lineRule="auto"/>
-            </w:pPr>
+              <w:rPr>
+                <w:sz w:val="18"/>
+                <w:szCs w:val="18"/>
+              </w:rPr>
+            </w:pPr>
+            <w:r>
+              <w:rPr>
+                <w:sz w:val="18"/>
+                <w:szCs w:val="18"/>
+              </w:rPr>
+              <w:t>Sudah</w:t>
+            </w:r>
           </w:p>
         </w:tc>
       </w:tr>
@@ -14312,7 +14521,18 @@
           <w:p>
             <w:pPr>
               <w:spacing w:before="20" w:after="20" w:line="252" w:lineRule="auto"/>
-            </w:pPr>
+              <w:rPr>
+                <w:sz w:val="18"/>
+                <w:szCs w:val="18"/>
+              </w:rPr>
+            </w:pPr>
+            <w:r>
+              <w:rPr>
+                <w:sz w:val="18"/>
+                <w:szCs w:val="18"/>
+              </w:rPr>
+              <w:t>25</w:t>
+            </w:r>
           </w:p>
         </w:tc>
         <w:tc>
@@ -14328,7 +14548,18 @@
           <w:p>
             <w:pPr>
               <w:spacing w:before="20" w:after="20" w:line="252" w:lineRule="auto"/>
-            </w:pPr>
+              <w:rPr>
+                <w:sz w:val="18"/>
+                <w:szCs w:val="18"/>
+              </w:rPr>
+            </w:pPr>
+            <w:r>
+              <w:rPr>
+                <w:sz w:val="18"/>
+                <w:szCs w:val="18"/>
+              </w:rPr>
+              <w:t>Sudah</w:t>
+            </w:r>
           </w:p>
         </w:tc>
       </w:tr>
@@ -14397,7 +14628,18 @@
           <w:p>
             <w:pPr>
               <w:spacing w:before="20" w:after="20" w:line="252" w:lineRule="auto"/>
-            </w:pPr>
+              <w:rPr>
+                <w:sz w:val="18"/>
+                <w:szCs w:val="18"/>
+              </w:rPr>
+            </w:pPr>
+            <w:r>
+              <w:rPr>
+                <w:sz w:val="18"/>
+                <w:szCs w:val="18"/>
+              </w:rPr>
+              <w:t>25-20</w:t>
+            </w:r>
           </w:p>
         </w:tc>
         <w:tc>
@@ -14413,7 +14655,18 @@
           <w:p>
             <w:pPr>
               <w:spacing w:before="20" w:after="20" w:line="252" w:lineRule="auto"/>
-            </w:pPr>
+              <w:rPr>
+                <w:sz w:val="18"/>
+                <w:szCs w:val="18"/>
+              </w:rPr>
+            </w:pPr>
+            <w:r>
+              <w:rPr>
+                <w:sz w:val="18"/>
+                <w:szCs w:val="18"/>
+              </w:rPr>
+              <w:t>Sudah</w:t>
+            </w:r>
           </w:p>
         </w:tc>
       </w:tr>
@@ -14482,7 +14735,18 @@
           <w:p>
             <w:pPr>
               <w:spacing w:before="20" w:after="20" w:line="252" w:lineRule="auto"/>
-            </w:pPr>
+              <w:rPr>
+                <w:sz w:val="18"/>
+                <w:szCs w:val="18"/>
+              </w:rPr>
+            </w:pPr>
+            <w:r>
+              <w:rPr>
+                <w:sz w:val="18"/>
+                <w:szCs w:val="18"/>
+              </w:rPr>
+              <w:t>15-10</w:t>
+            </w:r>
           </w:p>
         </w:tc>
         <w:tc>
@@ -14498,7 +14762,18 @@
           <w:p>
             <w:pPr>
               <w:spacing w:before="20" w:after="20" w:line="252" w:lineRule="auto"/>
-            </w:pPr>
+              <w:rPr>
+                <w:sz w:val="18"/>
+                <w:szCs w:val="18"/>
+              </w:rPr>
+            </w:pPr>
+            <w:r>
+              <w:rPr>
+                <w:sz w:val="18"/>
+                <w:szCs w:val="18"/>
+              </w:rPr>
+              <w:t>3 simpanan rusak, dengan hasil “Null”</w:t>
+            </w:r>
           </w:p>
         </w:tc>
       </w:tr>
@@ -14567,7 +14842,18 @@
           <w:p>
             <w:pPr>
               <w:spacing w:before="20" w:after="20" w:line="252" w:lineRule="auto"/>
-            </w:pPr>
+              <w:rPr>
+                <w:sz w:val="18"/>
+                <w:szCs w:val="18"/>
+              </w:rPr>
+            </w:pPr>
+            <w:r>
+              <w:rPr>
+                <w:sz w:val="18"/>
+                <w:szCs w:val="18"/>
+              </w:rPr>
+              <w:t>10</w:t>
+            </w:r>
           </w:p>
         </w:tc>
         <w:tc>
@@ -14583,7 +14869,18 @@
           <w:p>
             <w:pPr>
               <w:spacing w:before="20" w:after="20" w:line="252" w:lineRule="auto"/>
-            </w:pPr>
+              <w:rPr>
+                <w:sz w:val="18"/>
+                <w:szCs w:val="18"/>
+              </w:rPr>
+            </w:pPr>
+            <w:r>
+              <w:rPr>
+                <w:sz w:val="18"/>
+                <w:szCs w:val="18"/>
+              </w:rPr>
+              <w:t>Jujur, dan deklaeasi ada</w:t>
+            </w:r>
           </w:p>
         </w:tc>
       </w:tr>
@@ -14652,7 +14949,18 @@
           <w:p>
             <w:pPr>
               <w:spacing w:before="20" w:after="20" w:line="252" w:lineRule="auto"/>
-            </w:pPr>
+              <w:rPr>
+                <w:sz w:val="18"/>
+                <w:szCs w:val="18"/>
+              </w:rPr>
+            </w:pPr>
+            <w:r>
+              <w:rPr>
+                <w:sz w:val="18"/>
+                <w:szCs w:val="18"/>
+              </w:rPr>
+              <w:t>100-90</w:t>
+            </w:r>
           </w:p>
         </w:tc>
         <w:tc>
@@ -14668,6 +14976,10 @@
           <w:p>
             <w:pPr>
               <w:spacing w:before="20" w:after="20" w:line="252" w:lineRule="auto"/>
+              <w:rPr>
+                <w:sz w:val="18"/>
+                <w:szCs w:val="18"/>
+              </w:rPr>
             </w:pPr>
           </w:p>
         </w:tc>
@@ -14724,37 +15036,45 @@
               <w:right w:val="single" w:sz="4" w:space="0" w:color="B9C6E2"/>
             </w:tcBorders>
           </w:tcPr>
-          <w:p/>
-        </w:tc>
-      </w:tr>
-      <w:tr>
-        <w:trPr>
-          <w:trHeight w:val="351"/>
-        </w:trPr>
-        <w:tc>
-          <w:tcPr>
-            <w:tcW w:w="9751" w:type="dxa"/>
-            <w:tcBorders>
-              <w:top w:val="single" w:sz="4" w:space="0" w:color="B9C6E2"/>
-              <w:left w:val="single" w:sz="4" w:space="0" w:color="B9C6E2"/>
-              <w:bottom w:val="single" w:sz="4" w:space="0" w:color="B9C6E2"/>
-              <w:right w:val="single" w:sz="4" w:space="0" w:color="B9C6E2"/>
-            </w:tcBorders>
-          </w:tcPr>
-          <w:p/>
+          <w:p>
+            <w:pPr>
+              <w:rPr>
+                <w:sz w:val="20"/>
+                <w:szCs w:val="20"/>
+              </w:rPr>
+            </w:pPr>
+            <w:r>
+              <w:rPr>
+                <w:sz w:val="20"/>
+                <w:szCs w:val="20"/>
+              </w:rPr>
+              <w:t>Mengatur state, localStorage, dan penanganan simpanan rusak agar halaman tetap berjalan.</w:t>
+            </w:r>
+          </w:p>
         </w:tc>
       </w:tr>
     </w:tbl>
     <w:p>
       <w:pPr>
         <w:spacing w:after="60"/>
+        <w:rPr>
+          <w:sz w:val="20"/>
+          <w:szCs w:val="20"/>
+        </w:rPr>
       </w:pPr>
     </w:p>
     <w:p>
+      <w:pPr>
+        <w:rPr>
+          <w:sz w:val="20"/>
+          <w:szCs w:val="20"/>
+        </w:rPr>
+      </w:pPr>
       <w:r>
         <w:rPr>
           <w:rFonts w:cs="Carlito"/>
           <w:sz w:val="20"/>
+          <w:szCs w:val="20"/>
         </w:rPr>
         <w:t>Yang ingin saya bahas di kelas berikutnya:</w:t>
       </w:r>
@@ -14782,24 +15102,21 @@
               <w:right w:val="single" w:sz="4" w:space="0" w:color="B9C6E2"/>
             </w:tcBorders>
           </w:tcPr>
-          <w:p/>
-        </w:tc>
-      </w:tr>
-      <w:tr>
-        <w:trPr>
-          <w:trHeight w:val="351"/>
-        </w:trPr>
-        <w:tc>
-          <w:tcPr>
-            <w:tcW w:w="9751" w:type="dxa"/>
-            <w:tcBorders>
-              <w:top w:val="single" w:sz="4" w:space="0" w:color="B9C6E2"/>
-              <w:left w:val="single" w:sz="4" w:space="0" w:color="B9C6E2"/>
-              <w:bottom w:val="single" w:sz="4" w:space="0" w:color="B9C6E2"/>
-              <w:right w:val="single" w:sz="4" w:space="0" w:color="B9C6E2"/>
-            </w:tcBorders>
-          </w:tcPr>
-          <w:p/>
+          <w:p>
+            <w:pPr>
+              <w:rPr>
+                <w:sz w:val="20"/>
+                <w:szCs w:val="20"/>
+              </w:rPr>
+            </w:pPr>
+            <w:r>
+              <w:rPr>
+                <w:sz w:val="20"/>
+                <w:szCs w:val="20"/>
+              </w:rPr>
+              <w:t>Penanganan versi simpanan dan cara memastikan state tetap sinkron dengan tampilan.</w:t>
+            </w:r>
+          </w:p>
         </w:tc>
       </w:tr>
     </w:tbl>
@@ -14840,24 +15157,29 @@
               <w:right w:val="single" w:sz="4" w:space="0" w:color="B9C6E2"/>
             </w:tcBorders>
           </w:tcPr>
-          <w:p/>
-        </w:tc>
-      </w:tr>
-      <w:tr>
-        <w:trPr>
-          <w:trHeight w:val="351"/>
-        </w:trPr>
-        <w:tc>
-          <w:tcPr>
-            <w:tcW w:w="9751" w:type="dxa"/>
-            <w:tcBorders>
-              <w:top w:val="single" w:sz="4" w:space="0" w:color="B9C6E2"/>
-              <w:left w:val="single" w:sz="4" w:space="0" w:color="B9C6E2"/>
-              <w:bottom w:val="single" w:sz="4" w:space="0" w:color="B9C6E2"/>
-              <w:right w:val="single" w:sz="4" w:space="0" w:color="B9C6E2"/>
-            </w:tcBorders>
-          </w:tcPr>
-          <w:p/>
+          <w:p>
+            <w:pPr>
+              <w:rPr>
+                <w:sz w:val="20"/>
+                <w:szCs w:val="20"/>
+              </w:rPr>
+            </w:pPr>
+            <w:r>
+              <w:rPr>
+                <w:sz w:val="20"/>
+                <w:szCs w:val="20"/>
+              </w:rPr>
+              <w:lastRenderedPageBreak/>
+              <w:t>Semua berkas dari P10 dicopy ke P11</w:t>
+            </w:r>
+            <w:r>
+              <w:rPr>
+                <w:sz w:val="20"/>
+                <w:szCs w:val="20"/>
+              </w:rPr>
+              <w:t>.</w:t>
+            </w:r>
+          </w:p>
         </w:tc>
       </w:tr>
     </w:tbl>
@@ -14872,7 +15194,42 @@
           <w:rFonts w:cs="Carlito"/>
           <w:sz w:val="20"/>
         </w:rPr>
-        <w:t>Tanda tangan: ______________________________     Tanggal: ______________     Jam selesai: __________</w:t>
+        <w:t>Tanda tangan:</w:t>
+      </w:r>
+      <w:r>
+        <w:rPr>
+          <w:rFonts w:cs="Carlito"/>
+          <w:sz w:val="20"/>
+        </w:rPr>
+        <w:t xml:space="preserve"> -</w:t>
+      </w:r>
+      <w:r>
+        <w:rPr>
+          <w:rFonts w:cs="Carlito"/>
+          <w:sz w:val="20"/>
+        </w:rPr>
+        <w:t xml:space="preserve">     Tanggal: </w:t>
+      </w:r>
+      <w:r>
+        <w:rPr>
+          <w:rFonts w:cs="Carlito"/>
+          <w:sz w:val="20"/>
+        </w:rPr>
+        <w:t>19 October 2026</w:t>
+      </w:r>
+      <w:r>
+        <w:rPr>
+          <w:rFonts w:cs="Carlito"/>
+          <w:sz w:val="20"/>
+        </w:rPr>
+        <w:t xml:space="preserve">     Jam selesai: </w:t>
+      </w:r>
+      <w:r>
+        <w:rPr>
+          <w:rFonts w:cs="Carlito"/>
+          <w:sz w:val="20"/>
+        </w:rPr>
+        <w:t>17.25</w:t>
       </w:r>
     </w:p>
     <w:p>
@@ -16241,7 +16598,18 @@
           <w:p>
             <w:pPr>
               <w:spacing w:before="20" w:after="20" w:line="252" w:lineRule="auto"/>
-            </w:pPr>
+              <w:rPr>
+                <w:sz w:val="19"/>
+                <w:szCs w:val="19"/>
+              </w:rPr>
+            </w:pPr>
+            <w:r>
+              <w:rPr>
+                <w:sz w:val="19"/>
+                <w:szCs w:val="19"/>
+              </w:rPr>
+              <w:t>Saat fungsi atau variabel perlu digunakan oleh berkas JavaScript lain.</w:t>
+            </w:r>
           </w:p>
         </w:tc>
       </w:tr>
@@ -16310,7 +16678,18 @@
           <w:p>
             <w:pPr>
               <w:spacing w:before="20" w:after="20" w:line="252" w:lineRule="auto"/>
-            </w:pPr>
+              <w:rPr>
+                <w:sz w:val="19"/>
+                <w:szCs w:val="19"/>
+              </w:rPr>
+            </w:pPr>
+            <w:r>
+              <w:rPr>
+                <w:sz w:val="19"/>
+                <w:szCs w:val="19"/>
+              </w:rPr>
+              <w:t>Saat mengimpor modul dari berkas lain yang jalurnya relatif terhadap berkas saat ini.</w:t>
+            </w:r>
           </w:p>
         </w:tc>
       </w:tr>
@@ -16379,7 +16758,18 @@
           <w:p>
             <w:pPr>
               <w:spacing w:before="20" w:after="20" w:line="252" w:lineRule="auto"/>
-            </w:pPr>
+              <w:rPr>
+                <w:sz w:val="19"/>
+                <w:szCs w:val="19"/>
+              </w:rPr>
+            </w:pPr>
+            <w:r>
+              <w:rPr>
+                <w:sz w:val="19"/>
+                <w:szCs w:val="19"/>
+              </w:rPr>
+              <w:t>Saat membuat tempat untuk menyimpan keadaan aplikasi, seperti kategori aktif dan daftar favorit.</w:t>
+            </w:r>
           </w:p>
         </w:tc>
       </w:tr>
@@ -16448,7 +16838,18 @@
           <w:p>
             <w:pPr>
               <w:spacing w:before="20" w:after="20" w:line="252" w:lineRule="auto"/>
-            </w:pPr>
+              <w:rPr>
+                <w:sz w:val="19"/>
+                <w:szCs w:val="19"/>
+              </w:rPr>
+            </w:pPr>
+            <w:r>
+              <w:rPr>
+                <w:sz w:val="19"/>
+                <w:szCs w:val="19"/>
+              </w:rPr>
+              <w:t>Saat pengguna melakukan tindakan yang mengubah keadaan aplikasi, misalnya memilih kategori atau menambah favorit.</w:t>
+            </w:r>
           </w:p>
         </w:tc>
       </w:tr>
@@ -16477,6 +16878,7 @@
                 <w:rFonts w:cs="Carlito"/>
                 <w:sz w:val="19"/>
               </w:rPr>
+              <w:lastRenderedPageBreak/>
               <w:t>render(state)</w:t>
             </w:r>
           </w:p>
@@ -16517,7 +16919,18 @@
           <w:p>
             <w:pPr>
               <w:spacing w:before="20" w:after="20" w:line="252" w:lineRule="auto"/>
-            </w:pPr>
+              <w:rPr>
+                <w:sz w:val="19"/>
+                <w:szCs w:val="19"/>
+              </w:rPr>
+            </w:pPr>
+            <w:r>
+              <w:rPr>
+                <w:sz w:val="19"/>
+                <w:szCs w:val="19"/>
+              </w:rPr>
+              <w:t>Setelah state berubah untuk memperbarui tampilan agar sesuai dengan keadaan terbaru.</w:t>
+            </w:r>
           </w:p>
         </w:tc>
       </w:tr>
@@ -16586,7 +16999,18 @@
           <w:p>
             <w:pPr>
               <w:spacing w:before="20" w:after="20" w:line="252" w:lineRule="auto"/>
-            </w:pPr>
+              <w:rPr>
+                <w:sz w:val="19"/>
+                <w:szCs w:val="19"/>
+              </w:rPr>
+            </w:pPr>
+            <w:r>
+              <w:rPr>
+                <w:sz w:val="19"/>
+                <w:szCs w:val="19"/>
+              </w:rPr>
+              <w:t>Saat mengubah objek atau array menjadi teks sebelum disimpan ke localStorage.</w:t>
+            </w:r>
           </w:p>
         </w:tc>
       </w:tr>
@@ -16615,7 +17039,6 @@
                 <w:rFonts w:cs="Carlito"/>
                 <w:sz w:val="19"/>
               </w:rPr>
-              <w:lastRenderedPageBreak/>
               <w:t>JSON.parse</w:t>
             </w:r>
           </w:p>
@@ -16656,7 +17079,18 @@
           <w:p>
             <w:pPr>
               <w:spacing w:before="20" w:after="20" w:line="252" w:lineRule="auto"/>
-            </w:pPr>
+              <w:rPr>
+                <w:sz w:val="19"/>
+                <w:szCs w:val="19"/>
+              </w:rPr>
+            </w:pPr>
+            <w:r>
+              <w:rPr>
+                <w:sz w:val="19"/>
+                <w:szCs w:val="19"/>
+              </w:rPr>
+              <w:t>Saat membaca teks dari localStorage dan mengubahnya kembali menjadi objek atau array.</w:t>
+            </w:r>
           </w:p>
         </w:tc>
       </w:tr>
@@ -16725,7 +17159,18 @@
           <w:p>
             <w:pPr>
               <w:spacing w:before="20" w:after="20" w:line="252" w:lineRule="auto"/>
-            </w:pPr>
+              <w:rPr>
+                <w:sz w:val="19"/>
+                <w:szCs w:val="19"/>
+              </w:rPr>
+            </w:pPr>
+            <w:r>
+              <w:rPr>
+                <w:sz w:val="19"/>
+                <w:szCs w:val="19"/>
+              </w:rPr>
+              <w:t>Saat menyimpan atau membaca data pilihan pengguna dari penyimpanan peramban.</w:t>
+            </w:r>
           </w:p>
         </w:tc>
       </w:tr>
@@ -16794,7 +17239,18 @@
           <w:p>
             <w:pPr>
               <w:spacing w:before="20" w:after="20" w:line="252" w:lineRule="auto"/>
-            </w:pPr>
+              <w:rPr>
+                <w:sz w:val="19"/>
+                <w:szCs w:val="19"/>
+              </w:rPr>
+            </w:pPr>
+            <w:r>
+              <w:rPr>
+                <w:sz w:val="19"/>
+                <w:szCs w:val="19"/>
+              </w:rPr>
+              <w:t>Saat menghapus simpanan, misalnya ketika tombol atur ulang ditekan atau simpanan rusak ditemukan.</w:t>
+            </w:r>
           </w:p>
         </w:tc>
       </w:tr>
@@ -16863,7 +17319,18 @@
           <w:p>
             <w:pPr>
               <w:spacing w:before="20" w:after="20" w:line="252" w:lineRule="auto"/>
-            </w:pPr>
+              <w:rPr>
+                <w:sz w:val="19"/>
+                <w:szCs w:val="19"/>
+              </w:rPr>
+            </w:pPr>
+            <w:r>
+              <w:rPr>
+                <w:sz w:val="19"/>
+                <w:szCs w:val="19"/>
+              </w:rPr>
+              <w:t>Saat nilai yang dibaca bernilai null atau undefined, agar aplikasi tetap memiliki nilai awal.</w:t>
+            </w:r>
           </w:p>
         </w:tc>
       </w:tr>
@@ -18203,7 +18670,6 @@
                 <w:rFonts w:cs="Carlito"/>
                 <w:sz w:val="18"/>
               </w:rPr>
-              <w:lastRenderedPageBreak/>
               <w:t>git push</w:t>
             </w:r>
           </w:p>
@@ -18659,115 +19125,7 @@
         <w:color w:val="5A6080"/>
         <w:sz w:val="15"/>
       </w:rPr>
-      <w:t>PABW 2026/</w:t>
-    </w:r>
-    <w:proofErr w:type="gramStart"/>
-    <w:r>
-      <w:rPr>
-        <w:rFonts w:cs="Carlito"/>
-        <w:color w:val="5A6080"/>
-        <w:sz w:val="15"/>
-      </w:rPr>
-      <w:t>2027  ·</w:t>
-    </w:r>
-    <w:proofErr w:type="gramEnd"/>
-    <w:r>
-      <w:rPr>
-        <w:rFonts w:cs="Carlito"/>
-        <w:color w:val="5A6080"/>
-        <w:sz w:val="15"/>
-      </w:rPr>
-      <w:t xml:space="preserve">  </w:t>
-    </w:r>
-    <w:proofErr w:type="spellStart"/>
-    <w:r>
-      <w:rPr>
-        <w:rFonts w:cs="Carlito"/>
-        <w:color w:val="5A6080"/>
-        <w:sz w:val="15"/>
-      </w:rPr>
-      <w:t>Pertemuan</w:t>
-    </w:r>
-    <w:proofErr w:type="spellEnd"/>
-    <w:r>
-      <w:rPr>
-        <w:rFonts w:cs="Carlito"/>
-        <w:color w:val="5A6080"/>
-        <w:sz w:val="15"/>
-      </w:rPr>
-      <w:t xml:space="preserve"> </w:t>
-    </w:r>
-    <w:proofErr w:type="gramStart"/>
-    <w:r>
-      <w:rPr>
-        <w:rFonts w:cs="Carlito"/>
-        <w:color w:val="5A6080"/>
-        <w:sz w:val="15"/>
-      </w:rPr>
-      <w:t>11  ·</w:t>
-    </w:r>
-    <w:proofErr w:type="gramEnd"/>
-    <w:r>
-      <w:rPr>
-        <w:rFonts w:cs="Carlito"/>
-        <w:color w:val="5A6080"/>
-        <w:sz w:val="15"/>
-      </w:rPr>
-      <w:t xml:space="preserve">  Modul, State, dan </w:t>
-    </w:r>
-    <w:proofErr w:type="spellStart"/>
-    <w:r>
-      <w:rPr>
-        <w:rFonts w:cs="Carlito"/>
-        <w:color w:val="5A6080"/>
-        <w:sz w:val="15"/>
-      </w:rPr>
-      <w:t>Penyimpanan</w:t>
-    </w:r>
-    <w:proofErr w:type="spellEnd"/>
-    <w:r>
-      <w:rPr>
-        <w:rFonts w:cs="Carlito"/>
-        <w:color w:val="5A6080"/>
-        <w:sz w:val="15"/>
-      </w:rPr>
-      <w:t xml:space="preserve"> </w:t>
-    </w:r>
-    <w:proofErr w:type="gramStart"/>
-    <w:r>
-      <w:rPr>
-        <w:rFonts w:cs="Carlito"/>
-        <w:color w:val="5A6080"/>
-        <w:sz w:val="15"/>
-      </w:rPr>
-      <w:t>Klien  ·</w:t>
-    </w:r>
-    <w:proofErr w:type="gramEnd"/>
-    <w:r>
-      <w:rPr>
-        <w:rFonts w:cs="Carlito"/>
-        <w:color w:val="5A6080"/>
-        <w:sz w:val="15"/>
-      </w:rPr>
-      <w:t xml:space="preserve">  Universitas Islam </w:t>
-    </w:r>
-    <w:proofErr w:type="gramStart"/>
-    <w:r>
-      <w:rPr>
-        <w:rFonts w:cs="Carlito"/>
-        <w:color w:val="5A6080"/>
-        <w:sz w:val="15"/>
-      </w:rPr>
-      <w:t>Indonesia  ·</w:t>
-    </w:r>
-    <w:proofErr w:type="gramEnd"/>
-    <w:r>
-      <w:rPr>
-        <w:rFonts w:cs="Carlito"/>
-        <w:color w:val="5A6080"/>
-        <w:sz w:val="15"/>
-      </w:rPr>
-      <w:t xml:space="preserve">  halaman</w:t>
+      <w:t>PABW 2026/2027  ·  Pertemuan 11  ·  Modul, State, dan Penyimpanan Klien  ·  Universitas Islam Indonesia  ·  halaman</w:t>
     </w:r>
     <w:r>
       <w:fldChar w:fldCharType="begin"/>

</xml_diff>